<commit_message>
docs: designate Hemish Jain as Team Lead and Primary Member across all submission materials
- Updated presentation slides (SRMIST_FixFlow_Submission.pptx, PDF, and template copy) with Hemish Jain as Team Lead & Primary Member.
- Updated AI Disclosure forms (SRMIST_FixFlow_AI_Disclosure.docx & LangAI3.0_AI_Disclosure.docx) with Hemish Jain as Team Lead & Primary Representative.
- Updated README.md with dedicated Team Details section.
- Synchronized docs/FixFlow_TwoDev_Plan.md, docs/tasks.md, and docs/Jules_Workflow_Guide.md.
</commit_message>
<xml_diff>
--- a/LangAI3.0_AI_Disclosure.docx
+++ b/LangAI3.0_AI_Disclosure.docx
@@ -59,6 +59,16 @@
       </w:r>
       <w:r>
         <w:t>SRM Institute of Science and Technology (SRMIST)</w:t>
+        <w:br/>
+      </w:r>
+      <w:r>
+        <w:rPr>
+          <w:b/>
+        </w:rPr>
+        <w:t xml:space="preserve">Team Members: </w:t>
+      </w:r>
+      <w:r>
+        <w:t>Hemish Jain (Team Lead &amp; Primary Member), Mridul Mathur</w:t>
         <w:br/>
       </w:r>
       <w:r>
@@ -430,7 +440,7 @@
         <w:t xml:space="preserve">Name of Team Representative: </w:t>
       </w:r>
       <w:r>
-        <w:t>Mridul Mathur</w:t>
+        <w:t>Hemish Jain</w:t>
         <w:br/>
       </w:r>
       <w:r>
@@ -440,7 +450,7 @@
         <w:t xml:space="preserve">Role: </w:t>
       </w:r>
       <w:r>
-        <w:t>Team Lead &amp; Full-Stack AI Engineer</w:t>
+        <w:t>Team Lead &amp; Primary Representative</w:t>
         <w:br/>
       </w:r>
       <w:r>
@@ -470,7 +480,7 @@
         <w:t xml:space="preserve">Signature: </w:t>
       </w:r>
       <w:r>
-        <w:t>Mridul Mathur</w:t>
+        <w:t>Hemish Jain</w:t>
       </w:r>
     </w:p>
     <w:sectPr>

</xml_diff>

<commit_message>
docs: update team emails to official SRMIST addresses (hj0012@srmist.edu.in, mm4956@srmist.edu.in)
</commit_message>
<xml_diff>
--- a/LangAI3.0_AI_Disclosure.docx
+++ b/LangAI3.0_AI_Disclosure.docx
@@ -78,7 +78,7 @@
         <w:t xml:space="preserve">Team Members: </w:t>
       </w:r>
       <w:r>
-        <w:t>Hemish Jain (Team Lead &amp; Primary Member), Mridul Mathur</w:t>
+        <w:t>Hemish Jain (Team Lead &amp; Primary Member - hj0012@srmist.edu.in), Mridul Mathur (mm4956@srmist.edu.in)</w:t>
         <w:br/>
       </w:r>
       <w:r>
@@ -457,6 +457,16 @@
         <w:rPr>
           <w:b/>
         </w:rPr>
+        <w:t xml:space="preserve">Email: </w:t>
+      </w:r>
+      <w:r>
+        <w:t>hj0012@srmist.edu.in</w:t>
+        <w:br/>
+      </w:r>
+      <w:r>
+        <w:rPr>
+          <w:b/>
+        </w:rPr>
         <w:t xml:space="preserve">Role: </w:t>
       </w:r>
       <w:r>

</xml_diff>